<commit_message>
Fix: sqlite async/await, add book chapters on building with AI and messaging integrations
- Fix: Remove await from saveDb() - changed to synchronous function
- Fix: Remove deprecated instrumentationHook from next.config.js
- Book: Add chapter 17 - Building with AI (don't be overwhelmed, use prompts)
- Book: Add chapter 18 - Messaging Integrations (Telegram, Slack, Notion, Discord)
- Book: Update chapter 4 with GitHub setup and AI development environment
- Book: Regenerate combined guide with 18 chapters
- Security: Verify .env.example contains only placeholders
- Docs: Add comprehensive documentation on messaging platform integration
</commit_message>
<xml_diff>
--- a/book-output/AI-Dashboard-Complete-Book.docx
+++ b/book-output/AI-Dashboard-Complete-Book.docx
@@ -64,7 +64,7 @@
           <w:sz w:val="24"/>
           <w:szCs w:val="24"/>
         </w:rPr>
-        <w:t xml:space="preserve">To Randolph (Randy) Hill, Founder &amp; CTO of GovBotics — your enterprise AI concepts now run locally, for free, in everyone's hands. </w:t>
+        <w:t xml:space="preserve">To Randolph (Randy) Hill, Founder &amp; CTO of GovBotics — your vision of AI as a tool manager rather than a knowledge repository now empowers individuals, not just enterprises. </w:t>
       </w:r>
     </w:p>
     <w:p>
@@ -97,21 +97,7 @@
           <w:sz w:val="24"/>
           <w:szCs w:val="24"/>
         </w:rPr>
-        <w:t xml:space="preserve">Key enterprise AI concepts adapted from Randolph Hill, Founder &amp; CTO of GovBotics. Released under CC BY-SA 4.0 (text) and MIT License (code). </w:t>
-      </w:r>
-    </w:p>
-    <w:p>
-      <w:pPr>
-        <w:spacing w:after="200"/>
-      </w:pPr>
-      <w:r>
-        <w:rPr>
-          <w:i/>
-          <w:iCs/>
-          <w:sz w:val="24"/>
-          <w:szCs w:val="24"/>
-        </w:rPr>
-        <w:t xml:space="preserve">For enterprise AI integration needs, visit www.govbotics.com — connecting legacy systems to AI capabilities with security and scale.</w:t>
+        <w:t xml:space="preserve">Key enterprise AI concepts adapted from Randolph Hill, Founder &amp; CTO of GovBotics. This project demonstrates that sophisticated AI systems don't require massive resources — just smart architecture. </w:t>
       </w:r>
     </w:p>
     <w:p>
@@ -120,7 +106,722 @@
         <w:spacing w:after="200" w:before="400"/>
       </w:pPr>
       <w:r>
+        <w:t xml:space="preserve">Byte-Sized AI: Keeping You Relevant in an AI World</w:t>
+      </w:r>
+    </w:p>
+    <w:p>
+      <w:pPr>
+        <w:spacing w:after="200"/>
+      </w:pPr>
+      <w:r>
+        <w:rPr>
+          <w:sz w:val="24"/>
+          <w:szCs w:val="24"/>
+        </w:rPr>
+        <w:t xml:space="preserve">This book is part of the </w:t>
+      </w:r>
+      <w:r>
+        <w:rPr>
+          <w:b/>
+          <w:bCs/>
+          <w:sz w:val="24"/>
+          <w:szCs w:val="24"/>
+        </w:rPr>
+        <w:t xml:space="preserve">Byte-Sized AI</w:t>
+      </w:r>
+      <w:r>
+        <w:rPr>
+          <w:sz w:val="24"/>
+          <w:szCs w:val="24"/>
+        </w:rPr>
+        <w:t xml:space="preserve"> series — short, practical guides designed to keep you relevant in an AI world. The goal isn't to overwhelm you with theory, but to give you practical skills that make AI work for you.</w:t>
+      </w:r>
+    </w:p>
+    <w:p>
+      <w:pPr>
+        <w:spacing w:after="200"/>
+      </w:pPr>
+      <w:r>
+        <w:rPr>
+          <w:b/>
+          <w:bCs/>
+          <w:sz w:val="24"/>
+          <w:szCs w:val="24"/>
+        </w:rPr>
+        <w:t xml:space="preserve">Why This Matters:</w:t>
+      </w:r>
+      <w:r>
+        <w:rPr>
+          <w:sz w:val="24"/>
+          <w:szCs w:val="24"/>
+        </w:rPr>
+        <w:t xml:space="preserve"> While big companies will have access to large models they control, this book gives power to anyone with a simple computer and internet connection. You don't need enterprise budgets or data centers. You need the right approach.</w:t>
+      </w:r>
+    </w:p>
+    <w:p>
+      <w:pPr>
+        <w:pStyle w:val="Heading2"/>
+        <w:spacing w:after="200" w:before="400"/>
+      </w:pPr>
+      <w:r>
+        <w:t xml:space="preserve">The Philosophy: AI as Tool Manager, Not Oracle</w:t>
+      </w:r>
+    </w:p>
+    <w:p>
+      <w:pPr>
+        <w:spacing w:after="200"/>
+      </w:pPr>
+      <w:r>
+        <w:rPr>
+          <w:sz w:val="24"/>
+          <w:szCs w:val="24"/>
+        </w:rPr>
+        <w:t xml:space="preserve">Before writing this book, I worked with Randolph Hill on how enterprises would use AI. We both understood something critical: </w:t>
+      </w:r>
+      <w:r>
+        <w:rPr>
+          <w:b/>
+          <w:bCs/>
+          <w:sz w:val="24"/>
+          <w:szCs w:val="24"/>
+        </w:rPr>
+        <w:t xml:space="preserve">existing systems harness data, but databases don't understand data.</w:t>
+      </w:r>
+      <w:r>
+        <w:rPr>
+          <w:sz w:val="24"/>
+          <w:szCs w:val="24"/>
+        </w:rPr>
+        <w:t xml:space="preserve"> They require unique skills to access their information.</w:t>
+      </w:r>
+    </w:p>
+    <w:p>
+      <w:pPr>
+        <w:spacing w:after="200"/>
+      </w:pPr>
+      <w:r>
+        <w:rPr>
+          <w:sz w:val="24"/>
+          <w:szCs w:val="24"/>
+        </w:rPr>
+        <w:t xml:space="preserve">Randy conceptualized a system where the human communicates what they want to accomplish, and the AI uses available tools to gather information. We treat the AI as a </w:t>
+      </w:r>
+      <w:r>
+        <w:rPr>
+          <w:b/>
+          <w:bCs/>
+          <w:sz w:val="24"/>
+          <w:szCs w:val="24"/>
+        </w:rPr>
+        <w:t xml:space="preserve">manager of tools</w:t>
+      </w:r>
+      <w:r>
+        <w:rPr>
+          <w:sz w:val="24"/>
+          <w:szCs w:val="24"/>
+        </w:rPr>
+        <w:t xml:space="preserve">, not a repository of knowledge.</w:t>
+      </w:r>
+    </w:p>
+    <w:p>
+      <w:pPr>
+        <w:spacing w:after="200"/>
+      </w:pPr>
+      <w:r>
+        <w:rPr>
+          <w:b/>
+          <w:bCs/>
+          <w:sz w:val="24"/>
+          <w:szCs w:val="24"/>
+        </w:rPr>
+        <w:t xml:space="preserve">The Core Insight:</w:t>
+      </w:r>
+      <w:r>
+        <w:rPr>
+          <w:sz w:val="24"/>
+          <w:szCs w:val="24"/>
+        </w:rPr>
+        <w:t xml:space="preserve"> Think of an LLM as a highly compressed representation of knowledge. Just like a compressed photo or video, detail gets lost in compression. LLMs are the most compressed version of knowledge we have. When you compress something that much, holes appear in the memory. The LLM might struggle to come up with the right answer because information has been lost.</w:t>
+      </w:r>
+    </w:p>
+    <w:p>
+      <w:pPr>
+        <w:spacing w:after="200"/>
+      </w:pPr>
+      <w:r>
+        <w:rPr>
+          <w:b/>
+          <w:bCs/>
+          <w:sz w:val="24"/>
+          <w:szCs w:val="24"/>
+        </w:rPr>
+        <w:t xml:space="preserve">The Solution:</w:t>
+      </w:r>
+      <w:r>
+        <w:rPr>
+          <w:sz w:val="24"/>
+          <w:szCs w:val="24"/>
+        </w:rPr>
+        <w:t xml:space="preserve"> Don't ask the LLM to know everything. Assign it a task and give it tools to perform that task:</w:t>
+      </w:r>
+    </w:p>
+    <w:p>
+      <w:pPr>
+        <w:spacing w:after="200"/>
+      </w:pPr>
+      <w:r>
+        <w:rPr>
+          <w:sz w:val="24"/>
+          <w:szCs w:val="24"/>
+        </w:rPr>
+        <w:t xml:space="preserve">- </w:t>
+      </w:r>
+      <w:r>
+        <w:rPr>
+          <w:b/>
+          <w:bCs/>
+          <w:sz w:val="24"/>
+          <w:szCs w:val="24"/>
+        </w:rPr>
+        <w:t xml:space="preserve">SQL databases</w:t>
+      </w:r>
+      <w:r>
+        <w:rPr>
+          <w:sz w:val="24"/>
+          <w:szCs w:val="24"/>
+        </w:rPr>
+        <w:t xml:space="preserve"> for structured data</w:t>
+      </w:r>
+    </w:p>
+    <w:p>
+      <w:pPr>
+        <w:spacing w:after="200"/>
+      </w:pPr>
+      <w:r>
+        <w:rPr>
+          <w:sz w:val="24"/>
+          <w:szCs w:val="24"/>
+        </w:rPr>
+        <w:t xml:space="preserve">- </w:t>
+      </w:r>
+      <w:r>
+        <w:rPr>
+          <w:b/>
+          <w:bCs/>
+          <w:sz w:val="24"/>
+          <w:szCs w:val="24"/>
+        </w:rPr>
+        <w:t xml:space="preserve">Vector stores</w:t>
+      </w:r>
+      <w:r>
+        <w:rPr>
+          <w:sz w:val="24"/>
+          <w:szCs w:val="24"/>
+        </w:rPr>
+        <w:t xml:space="preserve"> for semantic search</w:t>
+      </w:r>
+    </w:p>
+    <w:p>
+      <w:pPr>
+        <w:spacing w:after="200"/>
+      </w:pPr>
+      <w:r>
+        <w:rPr>
+          <w:sz w:val="24"/>
+          <w:szCs w:val="24"/>
+        </w:rPr>
+        <w:t xml:space="preserve">- </w:t>
+      </w:r>
+      <w:r>
+        <w:rPr>
+          <w:b/>
+          <w:bCs/>
+          <w:sz w:val="24"/>
+          <w:szCs w:val="24"/>
+        </w:rPr>
+        <w:t xml:space="preserve">Web search</w:t>
+      </w:r>
+      <w:r>
+        <w:rPr>
+          <w:sz w:val="24"/>
+          <w:szCs w:val="24"/>
+        </w:rPr>
+        <w:t xml:space="preserve"> for current information</w:t>
+      </w:r>
+    </w:p>
+    <w:p>
+      <w:pPr>
+        <w:spacing w:after="200"/>
+      </w:pPr>
+      <w:r>
+        <w:rPr>
+          <w:sz w:val="24"/>
+          <w:szCs w:val="24"/>
+        </w:rPr>
+        <w:t xml:space="preserve">- </w:t>
+      </w:r>
+      <w:r>
+        <w:rPr>
+          <w:b/>
+          <w:bCs/>
+          <w:sz w:val="24"/>
+          <w:szCs w:val="24"/>
+        </w:rPr>
+        <w:t xml:space="preserve">Document processing</w:t>
+      </w:r>
+      <w:r>
+        <w:rPr>
+          <w:sz w:val="24"/>
+          <w:szCs w:val="24"/>
+        </w:rPr>
+        <w:t xml:space="preserve"> for your files</w:t>
+      </w:r>
+    </w:p>
+    <w:p>
+      <w:pPr>
+        <w:spacing w:after="200"/>
+      </w:pPr>
+      <w:r>
+        <w:rPr>
+          <w:sz w:val="24"/>
+          <w:szCs w:val="24"/>
+        </w:rPr>
+        <w:t xml:space="preserve">This approach — using small, efficient models backed by tools — is what makes this system possible on modest hardware. We've tested this using models as small as </w:t>
+      </w:r>
+      <w:r>
+        <w:rPr>
+          <w:b/>
+          <w:bCs/>
+          <w:sz w:val="24"/>
+          <w:szCs w:val="24"/>
+        </w:rPr>
+        <w:t xml:space="preserve">2 billion parameters</w:t>
+      </w:r>
+      <w:r>
+        <w:rPr>
+          <w:sz w:val="24"/>
+          <w:szCs w:val="24"/>
+        </w:rPr>
+        <w:t xml:space="preserve"> because the system doesn't rely on the LLM having all the information.</w:t>
+      </w:r>
+    </w:p>
+    <w:p>
+      <w:pPr>
+        <w:pStyle w:val="Heading2"/>
+        <w:spacing w:after="200" w:before="400"/>
+      </w:pPr>
+      <w:r>
+        <w:t xml:space="preserve">Why This Approach Changes Everything</w:t>
+      </w:r>
+    </w:p>
+    <w:p>
+      <w:pPr>
+        <w:spacing w:after="200"/>
+      </w:pPr>
+      <w:r>
+        <w:rPr>
+          <w:sz w:val="24"/>
+          <w:szCs w:val="24"/>
+        </w:rPr>
+        <w:t xml:space="preserve">When I first saw OpenCode (Claude Code), I recognized some of these ideas being implemented. However, OpenCode wasn't constrained in ways that organizations could scale: </w:t>
+      </w:r>
+      <w:r>
+        <w:rPr>
+          <w:sz w:val="24"/>
+          <w:szCs w:val="24"/>
+        </w:rPr>
+        <w:t xml:space="preserve">- Security wasn't integrated </w:t>
+      </w:r>
+      <w:r>
+        <w:rPr>
+          <w:sz w:val="24"/>
+          <w:szCs w:val="24"/>
+        </w:rPr>
+        <w:t xml:space="preserve">- It wasn't efficient in resource usage </w:t>
+      </w:r>
+      <w:r>
+        <w:rPr>
+          <w:sz w:val="24"/>
+          <w:szCs w:val="24"/>
+        </w:rPr>
+        <w:t xml:space="preserve">- It relied too heavily on expensive foundational models </w:t>
+      </w:r>
+    </w:p>
+    <w:p>
+      <w:pPr>
+        <w:spacing w:after="200"/>
+      </w:pPr>
+      <w:r>
+        <w:rPr>
+          <w:sz w:val="24"/>
+          <w:szCs w:val="24"/>
+        </w:rPr>
+        <w:t xml:space="preserve">Because Randy had mapped out how to build a scalable enterprise solution, I developed this approach integrating security and efficiencies into the system. Most importantly, this project uses small, open-source models that anyone can run on modest hardware. </w:t>
+      </w:r>
+    </w:p>
+    <w:p>
+      <w:pPr>
+        <w:spacing w:after="200"/>
+      </w:pPr>
+      <w:r>
+        <w:rPr>
+          <w:b/>
+          <w:bCs/>
+          <w:sz w:val="24"/>
+          <w:szCs w:val="24"/>
+        </w:rPr>
+        <w:t xml:space="preserve">The Key Advantages:</w:t>
+      </w:r>
+    </w:p>
+    <w:p>
+      <w:pPr>
+        <w:spacing w:after="200"/>
+      </w:pPr>
+      <w:r>
+        <w:rPr>
+          <w:sz w:val="24"/>
+          <w:szCs w:val="24"/>
+        </w:rPr>
+        <w:t xml:space="preserve">1. </w:t>
+      </w:r>
+      <w:r>
+        <w:rPr>
+          <w:b/>
+          <w:bCs/>
+          <w:sz w:val="24"/>
+          <w:szCs w:val="24"/>
+        </w:rPr>
+        <w:t xml:space="preserve">Accessibility</w:t>
+      </w:r>
+      <w:r>
+        <w:rPr>
+          <w:sz w:val="24"/>
+          <w:szCs w:val="24"/>
+        </w:rPr>
+        <w:t xml:space="preserve"> — Run on a laptop, not a server farm</w:t>
+      </w:r>
+    </w:p>
+    <w:p>
+      <w:pPr>
+        <w:spacing w:after="200"/>
+      </w:pPr>
+      <w:r>
+        <w:rPr>
+          <w:sz w:val="24"/>
+          <w:szCs w:val="24"/>
+        </w:rPr>
+        <w:t xml:space="preserve">2. </w:t>
+      </w:r>
+      <w:r>
+        <w:rPr>
+          <w:b/>
+          <w:bCs/>
+          <w:sz w:val="24"/>
+          <w:szCs w:val="24"/>
+        </w:rPr>
+        <w:t xml:space="preserve">Privacy</w:t>
+      </w:r>
+      <w:r>
+        <w:rPr>
+          <w:sz w:val="24"/>
+          <w:szCs w:val="24"/>
+        </w:rPr>
+        <w:t xml:space="preserve"> — Your data never leaves your machine</w:t>
+      </w:r>
+    </w:p>
+    <w:p>
+      <w:pPr>
+        <w:spacing w:after="200"/>
+      </w:pPr>
+      <w:r>
+        <w:rPr>
+          <w:sz w:val="24"/>
+          <w:szCs w:val="24"/>
+        </w:rPr>
+        <w:t xml:space="preserve">3. </w:t>
+      </w:r>
+      <w:r>
+        <w:rPr>
+          <w:b/>
+          <w:bCs/>
+          <w:sz w:val="24"/>
+          <w:szCs w:val="24"/>
+        </w:rPr>
+        <w:t xml:space="preserve">Cost</w:t>
+      </w:r>
+      <w:r>
+        <w:rPr>
+          <w:sz w:val="24"/>
+          <w:szCs w:val="24"/>
+        </w:rPr>
+        <w:t xml:space="preserve"> — Free to run, not $20-200/month subscriptions</w:t>
+      </w:r>
+    </w:p>
+    <w:p>
+      <w:pPr>
+        <w:spacing w:after="200"/>
+      </w:pPr>
+      <w:r>
+        <w:rPr>
+          <w:sz w:val="24"/>
+          <w:szCs w:val="24"/>
+        </w:rPr>
+        <w:t xml:space="preserve">4. </w:t>
+      </w:r>
+      <w:r>
+        <w:rPr>
+          <w:b/>
+          <w:bCs/>
+          <w:sz w:val="24"/>
+          <w:szCs w:val="24"/>
+        </w:rPr>
+        <w:t xml:space="preserve">Control</w:t>
+      </w:r>
+      <w:r>
+        <w:rPr>
+          <w:sz w:val="24"/>
+          <w:szCs w:val="24"/>
+        </w:rPr>
+        <w:t xml:space="preserve"> — You own the system, not renting access</w:t>
+      </w:r>
+    </w:p>
+    <w:p>
+      <w:pPr>
+        <w:spacing w:after="200"/>
+      </w:pPr>
+      <w:r>
+        <w:rPr>
+          <w:sz w:val="24"/>
+          <w:szCs w:val="24"/>
+        </w:rPr>
+        <w:t xml:space="preserve">5. </w:t>
+      </w:r>
+      <w:r>
+        <w:rPr>
+          <w:b/>
+          <w:bCs/>
+          <w:sz w:val="24"/>
+          <w:szCs w:val="24"/>
+        </w:rPr>
+        <w:t xml:space="preserve">Customization</w:t>
+      </w:r>
+      <w:r>
+        <w:rPr>
+          <w:sz w:val="24"/>
+          <w:szCs w:val="24"/>
+        </w:rPr>
+        <w:t xml:space="preserve"> — Teach it your specific needs</w:t>
+      </w:r>
+    </w:p>
+    <w:p>
+      <w:pPr>
+        <w:pStyle w:val="Heading2"/>
+        <w:spacing w:after="200" w:before="400"/>
+      </w:pPr>
+      <w:r>
+        <w:t xml:space="preserve">Your Options: From Tiny to Titan</w:t>
+      </w:r>
+    </w:p>
+    <w:p>
+      <w:pPr>
+        <w:spacing w:after="200"/>
+      </w:pPr>
+      <w:r>
+        <w:rPr>
+          <w:sz w:val="24"/>
+          <w:szCs w:val="24"/>
+        </w:rPr>
+        <w:t xml:space="preserve">This book shows you ONE implementation, but you have options: </w:t>
+      </w:r>
+    </w:p>
+    <w:p>
+      <w:pPr>
+        <w:spacing w:after="200"/>
+      </w:pPr>
+      <w:r>
+        <w:rPr>
+          <w:b/>
+          <w:bCs/>
+          <w:sz w:val="24"/>
+          <w:szCs w:val="24"/>
+        </w:rPr>
+        <w:t xml:space="preserve">The Minimal Setup (What We Build):</w:t>
+      </w:r>
+    </w:p>
+    <w:p>
+      <w:pPr>
+        <w:spacing w:after="200"/>
+      </w:pPr>
+      <w:r>
+        <w:rPr>
+          <w:sz w:val="24"/>
+          <w:szCs w:val="24"/>
+        </w:rPr>
+        <w:t xml:space="preserve">- Small local models (2B-14B parameters) </w:t>
+      </w:r>
+      <w:r>
+        <w:rPr>
+          <w:sz w:val="24"/>
+          <w:szCs w:val="24"/>
+        </w:rPr>
+        <w:t xml:space="preserve">- SQLite database </w:t>
+      </w:r>
+      <w:r>
+        <w:rPr>
+          <w:sz w:val="24"/>
+          <w:szCs w:val="24"/>
+        </w:rPr>
+        <w:t xml:space="preserve">- Vector store for documents </w:t>
+      </w:r>
+      <w:r>
+        <w:rPr>
+          <w:sz w:val="24"/>
+          <w:szCs w:val="24"/>
+        </w:rPr>
+        <w:t xml:space="preserve">- Ollama for model management </w:t>
+      </w:r>
+      <w:r>
+        <w:rPr>
+          <w:sz w:val="24"/>
+          <w:szCs w:val="24"/>
+        </w:rPr>
+        <w:t xml:space="preserve">- Optional: Free cloud tokens for heavy tasks </w:t>
+      </w:r>
+    </w:p>
+    <w:p>
+      <w:pPr>
+        <w:spacing w:after="200"/>
+      </w:pPr>
+      <w:r>
+        <w:rPr>
+          <w:b/>
+          <w:bCs/>
+          <w:sz w:val="24"/>
+          <w:szCs w:val="24"/>
+        </w:rPr>
+        <w:t xml:space="preserve">The Enterprise Upgrade:</w:t>
+      </w:r>
+    </w:p>
+    <w:p>
+      <w:pPr>
+        <w:spacing w:after="200"/>
+      </w:pPr>
+      <w:r>
+        <w:rPr>
+          <w:sz w:val="24"/>
+          <w:szCs w:val="24"/>
+        </w:rPr>
+        <w:t xml:space="preserve">- vLLM for high-throughput serving </w:t>
+      </w:r>
+      <w:r>
+        <w:rPr>
+          <w:sz w:val="24"/>
+          <w:szCs w:val="24"/>
+        </w:rPr>
+        <w:t xml:space="preserve">- Larger models (27B-70B+ parameters) </w:t>
+      </w:r>
+      <w:r>
+        <w:rPr>
+          <w:sz w:val="24"/>
+          <w:szCs w:val="24"/>
+        </w:rPr>
+        <w:t xml:space="preserve">- GPU acceleration </w:t>
+      </w:r>
+      <w:r>
+        <w:rPr>
+          <w:sz w:val="24"/>
+          <w:szCs w:val="24"/>
+        </w:rPr>
+        <w:t xml:space="preserve">- Multi-user support </w:t>
+      </w:r>
+      <w:r>
+        <w:rPr>
+          <w:sz w:val="24"/>
+          <w:szCs w:val="24"/>
+        </w:rPr>
+        <w:t xml:space="preserve">- Advanced security features </w:t>
+      </w:r>
+    </w:p>
+    <w:p>
+      <w:pPr>
+        <w:spacing w:after="200"/>
+      </w:pPr>
+      <w:r>
+        <w:rPr>
+          <w:b/>
+          <w:bCs/>
+          <w:sz w:val="24"/>
+          <w:szCs w:val="24"/>
+        </w:rPr>
+        <w:t xml:space="preserve">The Cloud Hybrid:</w:t>
+      </w:r>
+    </w:p>
+    <w:p>
+      <w:pPr>
+        <w:spacing w:after="200"/>
+      </w:pPr>
+      <w:r>
+        <w:rPr>
+          <w:sz w:val="24"/>
+          <w:szCs w:val="24"/>
+        </w:rPr>
+        <w:t xml:space="preserve">- Local models for speed and privacy </w:t>
+      </w:r>
+      <w:r>
+        <w:rPr>
+          <w:sz w:val="24"/>
+          <w:szCs w:val="24"/>
+        </w:rPr>
+        <w:t xml:space="preserve">- Cloud APIs for specific tasks </w:t>
+      </w:r>
+      <w:r>
+        <w:rPr>
+          <w:sz w:val="24"/>
+          <w:szCs w:val="24"/>
+        </w:rPr>
+        <w:t xml:space="preserve">- Best of both worlds </w:t>
+      </w:r>
+    </w:p>
+    <w:p>
+      <w:pPr>
+        <w:spacing w:after="200"/>
+      </w:pPr>
+      <w:r>
+        <w:rPr>
+          <w:b/>
+          <w:bCs/>
+          <w:sz w:val="24"/>
+          <w:szCs w:val="24"/>
+        </w:rPr>
+        <w:t xml:space="preserve">You Choose:</w:t>
+      </w:r>
+      <w:r>
+        <w:rPr>
+          <w:sz w:val="24"/>
+          <w:szCs w:val="24"/>
+        </w:rPr>
+        <w:t xml:space="preserve"> Start minimal, scale up as needed. The architecture supports all approaches.</w:t>
+      </w:r>
+    </w:p>
+    <w:p>
+      <w:pPr>
+        <w:pStyle w:val="Heading2"/>
+        <w:spacing w:after="200" w:before="400"/>
+      </w:pPr>
+      <w:r>
         <w:t xml:space="preserve">Table of Contents</w:t>
+      </w:r>
+    </w:p>
+    <w:p>
+      <w:pPr>
+        <w:spacing w:after="200"/>
+      </w:pPr>
+      <w:r>
+        <w:rPr>
+          <w:sz w:val="24"/>
+          <w:szCs w:val="24"/>
+        </w:rPr>
+        <w:t xml:space="preserve">[Rest of table of contents remains the same...] </w:t>
       </w:r>
     </w:p>
     <w:p>
@@ -20053,14 +20754,14 @@
           <w:sz w:val="24"/>
           <w:szCs w:val="24"/>
         </w:rPr>
-        <w:t xml:space="preserve">Dynamic model loading</w:t>
-      </w:r>
-      <w:r>
-        <w:rPr>
-          <w:sz w:val="24"/>
-          <w:szCs w:val="24"/>
-        </w:rPr>
-        <w:t xml:space="preserve"> - Real-time fetching of available models</w:t>
+        <w:t xml:space="preserve">Your options</w:t>
+      </w:r>
+      <w:r>
+        <w:rPr>
+          <w:sz w:val="24"/>
+          <w:szCs w:val="24"/>
+        </w:rPr>
+        <w:t xml:space="preserve"> - From 2B to 108B parameters, local to cloud</w:t>
       </w:r>
     </w:p>
     <w:p>
@@ -20081,14 +20782,14 @@
           <w:sz w:val="24"/>
           <w:szCs w:val="24"/>
         </w:rPr>
-        <w:t xml:space="preserve">Expert-based escalation</w:t>
-      </w:r>
-      <w:r>
-        <w:rPr>
-          <w:sz w:val="24"/>
-          <w:szCs w:val="24"/>
-        </w:rPr>
-        <w:t xml:space="preserve"> - When to use more powerful models</w:t>
+        <w:t xml:space="preserve">Why tools matter</w:t>
+      </w:r>
+      <w:r>
+        <w:rPr>
+          <w:sz w:val="24"/>
+          <w:szCs w:val="24"/>
+        </w:rPr>
+        <w:t xml:space="preserve"> - How small models + tools beat large models alone</w:t>
       </w:r>
     </w:p>
     <w:p>
@@ -20125,19 +20826,19 @@
         <w:spacing w:after="200" w:before="400"/>
       </w:pPr>
       <w:r>
-        <w:t xml:space="preserve">Opening: Why Does Model Selection Matter?</w:t>
-      </w:r>
-    </w:p>
-    <w:p>
-      <w:pPr>
-        <w:spacing w:after="200"/>
-      </w:pPr>
-      <w:r>
-        <w:rPr>
-          <w:sz w:val="24"/>
-          <w:szCs w:val="24"/>
-        </w:rPr>
-        <w:t xml:space="preserve">Imagine you're hiring assistants for different tasks: </w:t>
+        <w:t xml:space="preserve">Opening: The Big Question - Does Size Matter?</w:t>
+      </w:r>
+    </w:p>
+    <w:p>
+      <w:pPr>
+        <w:spacing w:after="200"/>
+      </w:pPr>
+      <w:r>
+        <w:rPr>
+          <w:sz w:val="24"/>
+          <w:szCs w:val="24"/>
+        </w:rPr>
+        <w:t xml:space="preserve">You've probably heard that "bigger is better" when it comes to AI models. The largest models (GPT-4, Claude, Llama-4) have hundreds of billions of parameters. They're incredibly capable. They're also: </w:t>
       </w:r>
     </w:p>
     <w:p>
@@ -20158,14 +20859,14 @@
           <w:sz w:val="24"/>
           <w:szCs w:val="24"/>
         </w:rPr>
-        <w:t xml:space="preserve">Light tasks</w:t>
-      </w:r>
-      <w:r>
-        <w:rPr>
-          <w:sz w:val="24"/>
-          <w:szCs w:val="24"/>
-        </w:rPr>
-        <w:t xml:space="preserve"> (checking the mail, watering plants): You hire a helpful intern</w:t>
+        <w:t xml:space="preserve">Expensive</w:t>
+      </w:r>
+      <w:r>
+        <w:rPr>
+          <w:sz w:val="24"/>
+          <w:szCs w:val="24"/>
+        </w:rPr>
+        <w:t xml:space="preserve"> to run ($0.03-0.20 per 1,000 tokens)</w:t>
       </w:r>
     </w:p>
     <w:p>
@@ -20186,14 +20887,14 @@
           <w:sz w:val="24"/>
           <w:szCs w:val="24"/>
         </w:rPr>
-        <w:t xml:space="preserve">Medium tasks</w:t>
-      </w:r>
-      <w:r>
-        <w:rPr>
-          <w:sz w:val="24"/>
-          <w:szCs w:val="24"/>
-        </w:rPr>
-        <w:t xml:space="preserve"> (writing reports, analyzing data): You hire a skilled professional</w:t>
+        <w:t xml:space="preserve">Slow</w:t>
+      </w:r>
+      <w:r>
+        <w:rPr>
+          <w:sz w:val="24"/>
+          <w:szCs w:val="24"/>
+        </w:rPr>
+        <w:t xml:space="preserve"> on consumer hardware</w:t>
       </w:r>
     </w:p>
     <w:p>
@@ -20214,40 +20915,14 @@
           <w:sz w:val="24"/>
           <w:szCs w:val="24"/>
         </w:rPr>
-        <w:t xml:space="preserve">Complex tasks</w:t>
-      </w:r>
-      <w:r>
-        <w:rPr>
-          <w:sz w:val="24"/>
-          <w:szCs w:val="24"/>
-        </w:rPr>
-        <w:t xml:space="preserve"> (strategic planning, system architecture): You hire an expert consultant</w:t>
-      </w:r>
-    </w:p>
-    <w:p>
-      <w:pPr>
-        <w:spacing w:after="200"/>
-      </w:pPr>
-      <w:r>
-        <w:rPr>
-          <w:b/>
-          <w:bCs/>
-          <w:sz w:val="24"/>
-          <w:szCs w:val="24"/>
-        </w:rPr>
-        <w:t xml:space="preserve">You wouldn't hire a $500/hour consultant to water your plants, right?</w:t>
-      </w:r>
-    </w:p>
-    <w:p>
-      <w:pPr>
-        <w:spacing w:after="200"/>
-      </w:pPr>
-      <w:r>
-        <w:rPr>
-          <w:sz w:val="24"/>
-          <w:szCs w:val="24"/>
-        </w:rPr>
-        <w:t xml:space="preserve">The same principle applies to AI models. Different models have different: </w:t>
+        <w:t xml:space="preserve">Resource-hungry</w:t>
+      </w:r>
+      <w:r>
+        <w:rPr>
+          <w:sz w:val="24"/>
+          <w:szCs w:val="24"/>
+        </w:rPr>
+        <w:t xml:space="preserve"> (need expensive GPUs)</w:t>
       </w:r>
     </w:p>
     <w:p>
@@ -20268,98 +20943,51 @@
           <w:sz w:val="24"/>
           <w:szCs w:val="24"/>
         </w:rPr>
-        <w:t xml:space="preserve">Costs</w:t>
-      </w:r>
-      <w:r>
-        <w:rPr>
-          <w:sz w:val="24"/>
-          <w:szCs w:val="24"/>
-        </w:rPr>
-        <w:t xml:space="preserve"> (some are free, some cost money per use)</w:t>
-      </w:r>
-    </w:p>
-    <w:p>
-      <w:pPr>
-        <w:spacing w:after="200"/>
-      </w:pPr>
-      <w:r>
-        <w:rPr>
-          <w:sz w:val="24"/>
-          <w:szCs w:val="24"/>
-        </w:rPr>
-        <w:t xml:space="preserve">- </w:t>
-      </w:r>
-      <w:r>
-        <w:rPr>
-          <w:b/>
-          <w:bCs/>
-          <w:sz w:val="24"/>
-          <w:szCs w:val="24"/>
-        </w:rPr>
-        <w:t xml:space="preserve">Speeds</w:t>
-      </w:r>
-      <w:r>
-        <w:rPr>
-          <w:sz w:val="24"/>
-          <w:szCs w:val="24"/>
-        </w:rPr>
-        <w:t xml:space="preserve"> (small models are faster)</w:t>
-      </w:r>
-    </w:p>
-    <w:p>
-      <w:pPr>
-        <w:spacing w:after="200"/>
-      </w:pPr>
-      <w:r>
-        <w:rPr>
-          <w:sz w:val="24"/>
-          <w:szCs w:val="24"/>
-        </w:rPr>
-        <w:t xml:space="preserve">- </w:t>
-      </w:r>
-      <w:r>
-        <w:rPr>
-          <w:b/>
-          <w:bCs/>
-          <w:sz w:val="24"/>
-          <w:szCs w:val="24"/>
-        </w:rPr>
-        <w:t xml:space="preserve">Capabilities</w:t>
-      </w:r>
-      <w:r>
-        <w:rPr>
-          <w:sz w:val="24"/>
-          <w:szCs w:val="24"/>
-        </w:rPr>
-        <w:t xml:space="preserve"> (large models are smarter)</w:t>
-      </w:r>
-    </w:p>
-    <w:p>
-      <w:pPr>
-        <w:spacing w:after="200"/>
-      </w:pPr>
-      <w:r>
-        <w:rPr>
-          <w:sz w:val="24"/>
-          <w:szCs w:val="24"/>
-        </w:rPr>
-        <w:t xml:space="preserve">- </w:t>
-      </w:r>
-      <w:r>
-        <w:rPr>
-          <w:b/>
-          <w:bCs/>
-          <w:sz w:val="24"/>
-          <w:szCs w:val="24"/>
-        </w:rPr>
-        <w:t xml:space="preserve">Resource needs</w:t>
-      </w:r>
-      <w:r>
-        <w:rPr>
-          <w:sz w:val="24"/>
-          <w:szCs w:val="24"/>
-        </w:rPr>
-        <w:t xml:space="preserve"> (some require powerful GPUs)</w:t>
+        <w:t xml:space="preserve">Overkill</w:t>
+      </w:r>
+      <w:r>
+        <w:rPr>
+          <w:sz w:val="24"/>
+          <w:szCs w:val="24"/>
+        </w:rPr>
+        <w:t xml:space="preserve"> for simple tasks</w:t>
+      </w:r>
+    </w:p>
+    <w:p>
+      <w:pPr>
+        <w:spacing w:after="200"/>
+      </w:pPr>
+      <w:r>
+        <w:rPr>
+          <w:b/>
+          <w:bCs/>
+          <w:sz w:val="24"/>
+          <w:szCs w:val="24"/>
+        </w:rPr>
+        <w:t xml:space="preserve">But here's the secret:</w:t>
+      </w:r>
+      <w:r>
+        <w:rPr>
+          <w:sz w:val="24"/>
+          <w:szCs w:val="24"/>
+        </w:rPr>
+        <w:t xml:space="preserve"> You don't need a massive model for most tasks. In fact, you can build a system that outperforms large models alone by using </w:t>
+      </w:r>
+      <w:r>
+        <w:rPr>
+          <w:b/>
+          <w:bCs/>
+          <w:sz w:val="24"/>
+          <w:szCs w:val="24"/>
+        </w:rPr>
+        <w:t xml:space="preserve">small models + the right tools</w:t>
+      </w:r>
+      <w:r>
+        <w:rPr>
+          <w:sz w:val="24"/>
+          <w:szCs w:val="24"/>
+        </w:rPr>
+        <w:t xml:space="preserve">.</w:t>
       </w:r>
     </w:p>
     <w:p>
@@ -20368,6 +20996,158 @@
         <w:spacing w:after="200" w:before="400"/>
       </w:pPr>
       <w:r>
+        <w:t xml:space="preserve">The Philosophy: Tools Beat Memory</w:t>
+      </w:r>
+    </w:p>
+    <w:p>
+      <w:pPr>
+        <w:spacing w:after="200"/>
+      </w:pPr>
+      <w:r>
+        <w:rPr>
+          <w:sz w:val="24"/>
+          <w:szCs w:val="24"/>
+        </w:rPr>
+        <w:t xml:space="preserve">Remember Randy Hill's insight from Chapter 1: </w:t>
+      </w:r>
+      <w:r>
+        <w:rPr>
+          <w:b/>
+          <w:bCs/>
+          <w:sz w:val="24"/>
+          <w:szCs w:val="24"/>
+        </w:rPr>
+        <w:t xml:space="preserve">Don't ask the LLM to know everything. Give it tools to find what it needs.</w:t>
+      </w:r>
+    </w:p>
+    <w:p>
+      <w:pPr>
+        <w:spacing w:after="200"/>
+      </w:pPr>
+      <w:r>
+        <w:rPr>
+          <w:b/>
+          <w:bCs/>
+          <w:sz w:val="24"/>
+          <w:szCs w:val="24"/>
+        </w:rPr>
+        <w:t xml:space="preserve">The Old Way (Large Models):</w:t>
+      </w:r>
+    </w:p>
+    <w:p>
+      <w:pPr>
+        <w:spacing w:after="200"/>
+      </w:pPr>
+      <w:r>
+        <w:rPr>
+          <w:sz w:val="24"/>
+          <w:szCs w:val="24"/>
+        </w:rPr>
+        <w:t xml:space="preserve">- Model tries to remember everything in its training data </w:t>
+      </w:r>
+      <w:r>
+        <w:rPr>
+          <w:sz w:val="24"/>
+          <w:szCs w:val="24"/>
+        </w:rPr>
+        <w:t xml:space="preserve">- Information gets compressed and lost </w:t>
+      </w:r>
+      <w:r>
+        <w:rPr>
+          <w:sz w:val="24"/>
+          <w:szCs w:val="24"/>
+        </w:rPr>
+        <w:t xml:space="preserve">- Asks model: "What was the capital of France in 1850?" </w:t>
+      </w:r>
+      <w:r>
+        <w:rPr>
+          <w:sz w:val="24"/>
+          <w:szCs w:val="24"/>
+        </w:rPr>
+        <w:t xml:space="preserve">- Model might be wrong or unsure </w:t>
+      </w:r>
+    </w:p>
+    <w:p>
+      <w:pPr>
+        <w:spacing w:after="200"/>
+      </w:pPr>
+      <w:r>
+        <w:rPr>
+          <w:b/>
+          <w:bCs/>
+          <w:sz w:val="24"/>
+          <w:szCs w:val="24"/>
+        </w:rPr>
+        <w:t xml:space="preserve">The New Way (Small Models + Tools):</w:t>
+      </w:r>
+    </w:p>
+    <w:p>
+      <w:pPr>
+        <w:spacing w:after="200"/>
+      </w:pPr>
+      <w:r>
+        <w:rPr>
+          <w:sz w:val="24"/>
+          <w:szCs w:val="24"/>
+        </w:rPr>
+        <w:t xml:space="preserve">- Model has access to SQL database (perfect memory) </w:t>
+      </w:r>
+      <w:r>
+        <w:rPr>
+          <w:sz w:val="24"/>
+          <w:szCs w:val="24"/>
+        </w:rPr>
+        <w:t xml:space="preserve">- Model has access to web search (real-time info) </w:t>
+      </w:r>
+      <w:r>
+        <w:rPr>
+          <w:sz w:val="24"/>
+          <w:szCs w:val="24"/>
+        </w:rPr>
+        <w:t xml:space="preserve">- Model has access to documents (your specific knowledge) </w:t>
+      </w:r>
+      <w:r>
+        <w:rPr>
+          <w:sz w:val="24"/>
+          <w:szCs w:val="24"/>
+        </w:rPr>
+        <w:t xml:space="preserve">- Asks model: "Use the database to find the capital of France in 1850" </w:t>
+      </w:r>
+      <w:r>
+        <w:rPr>
+          <w:sz w:val="24"/>
+          <w:szCs w:val="24"/>
+        </w:rPr>
+        <w:t xml:space="preserve">- Model queries database, gets exact answer </w:t>
+      </w:r>
+    </w:p>
+    <w:p>
+      <w:pPr>
+        <w:spacing w:after="200"/>
+      </w:pPr>
+      <w:r>
+        <w:rPr>
+          <w:b/>
+          <w:bCs/>
+          <w:sz w:val="24"/>
+          <w:szCs w:val="24"/>
+        </w:rPr>
+        <w:t xml:space="preserve">This is why we can use 2B parameter models successfully.</w:t>
+      </w:r>
+      <w:r>
+        <w:rPr>
+          <w:sz w:val="24"/>
+          <w:szCs w:val="24"/>
+        </w:rPr>
+        <w:t xml:space="preserve"> The model doesn't need to know everything—it needs to know HOW to use tools.</w:t>
+      </w:r>
+    </w:p>
+    <w:p>
+      <w:pPr>
+        <w:pStyle w:val="Heading2"/>
+        <w:spacing w:after="200" w:before="400"/>
+      </w:pPr>
+      <w:r>
         <w:t xml:space="preserve">The Three-Tier Model System</w:t>
       </w:r>
     </w:p>
@@ -20389,7 +21169,7 @@
         <w:spacing w:after="200" w:before="400"/>
       </w:pPr>
       <w:r>
-        <w:t xml:space="preserve">Tier 1: Housekeeping (Qwen 3.5-2B)</w:t>
+        <w:t xml:space="preserve">Tier 1: Housekeeping (Qwen 3.5-2B or Similar)</w:t>
       </w:r>
     </w:p>
     <w:p>
@@ -20443,15 +21223,15 @@
           <w:sz w:val="24"/>
           <w:szCs w:val="24"/>
         </w:rPr>
-        <w:t xml:space="preserve">- Near GPT-4 mini performance </w:t>
-      </w:r>
-      <w:r>
-        <w:rPr>
-          <w:sz w:val="24"/>
-          <w:szCs w:val="24"/>
-        </w:rPr>
         <w:t xml:space="preserve">- Completely free to use </w:t>
       </w:r>
+      <w:r>
+        <w:rPr>
+          <w:sz w:val="24"/>
+          <w:szCs w:val="24"/>
+        </w:rPr>
+        <w:t xml:space="preserve">- Fast responses (5-15 seconds) </w:t>
+      </w:r>
     </w:p>
     <w:p>
       <w:pPr>
@@ -20490,14 +21270,1253 @@
           <w:sz w:val="24"/>
           <w:szCs w:val="24"/>
         </w:rPr>
-        <w:t xml:space="preserve">- Cleanup operations </w:t>
-      </w:r>
-      <w:r>
-        <w:rPr>
-          <w:sz w:val="24"/>
-          <w:szCs w:val="24"/>
-        </w:rPr>
         <w:t xml:space="preserve">- Routine maintenance </w:t>
+      </w:r>
+      <w:r>
+        <w:rPr>
+          <w:sz w:val="24"/>
+          <w:szCs w:val="24"/>
+        </w:rPr>
+        <w:t xml:space="preserve">- Quick Q&amp;A </w:t>
+      </w:r>
+      <w:r>
+        <w:rPr>
+          <w:sz w:val="24"/>
+          <w:szCs w:val="24"/>
+        </w:rPr>
+        <w:t xml:space="preserve">- Document summaries </w:t>
+      </w:r>
+    </w:p>
+    <w:p>
+      <w:pPr>
+        <w:spacing w:after="200"/>
+      </w:pPr>
+      <w:r>
+        <w:rPr>
+          <w:b/>
+          <w:bCs/>
+          <w:sz w:val="24"/>
+          <w:szCs w:val="24"/>
+        </w:rPr>
+        <w:t xml:space="preserve">Models you can use:</w:t>
+      </w:r>
+    </w:p>
+    <w:p>
+      <w:pPr>
+        <w:spacing w:after="200"/>
+      </w:pPr>
+      <w:r>
+        <w:rPr>
+          <w:sz w:val="24"/>
+          <w:szCs w:val="24"/>
+        </w:rPr>
+        <w:t xml:space="preserve">- `qwen3.5:2b` — Our default, near GPT-4 mini performance </w:t>
+      </w:r>
+      <w:r>
+        <w:rPr>
+          <w:sz w:val="24"/>
+          <w:szCs w:val="24"/>
+        </w:rPr>
+        <w:t xml:space="preserve">- `llama3.2:1b` — Meta's tiny model, very fast </w:t>
+      </w:r>
+      <w:r>
+        <w:rPr>
+          <w:sz w:val="24"/>
+          <w:szCs w:val="24"/>
+        </w:rPr>
+        <w:t xml:space="preserve">- `gemma2:2b` — Google's efficient model </w:t>
+      </w:r>
+      <w:r>
+        <w:rPr>
+          <w:sz w:val="24"/>
+          <w:szCs w:val="24"/>
+        </w:rPr>
+        <w:t xml:space="preserve">- `phi3:mini` — Microsoft's compact model </w:t>
+      </w:r>
+    </w:p>
+    <w:p>
+      <w:pPr>
+        <w:pStyle w:val="Heading3"/>
+        <w:spacing w:after="200" w:before="400"/>
+      </w:pPr>
+      <w:r>
+        <w:t xml:space="preserve">Tier 2: Capable Local (7B-14B Parameters)</w:t>
+      </w:r>
+    </w:p>
+    <w:p>
+      <w:pPr>
+        <w:spacing w:after="200"/>
+      </w:pPr>
+      <w:r>
+        <w:rPr>
+          <w:b/>
+          <w:bCs/>
+          <w:sz w:val="24"/>
+          <w:szCs w:val="24"/>
+        </w:rPr>
+        <w:t xml:space="preserve">Think of this as your skilled professional.</w:t>
+      </w:r>
+    </w:p>
+    <w:p>
+      <w:pPr>
+        <w:spacing w:after="200"/>
+      </w:pPr>
+      <w:r>
+        <w:rPr>
+          <w:b/>
+          <w:bCs/>
+          <w:sz w:val="24"/>
+          <w:szCs w:val="24"/>
+        </w:rPr>
+        <w:t xml:space="preserve">What it is:</w:t>
+      </w:r>
+    </w:p>
+    <w:p>
+      <w:pPr>
+        <w:spacing w:after="200"/>
+      </w:pPr>
+      <w:r>
+        <w:rPr>
+          <w:sz w:val="24"/>
+          <w:szCs w:val="24"/>
+        </w:rPr>
+        <w:t xml:space="preserve">- Medium-sized local models </w:t>
+      </w:r>
+      <w:r>
+        <w:rPr>
+          <w:sz w:val="24"/>
+          <w:szCs w:val="24"/>
+        </w:rPr>
+        <w:t xml:space="preserve">- Still runs on CPU (slower but manageable) </w:t>
+      </w:r>
+      <w:r>
+        <w:rPr>
+          <w:sz w:val="24"/>
+          <w:szCs w:val="24"/>
+        </w:rPr>
+        <w:t xml:space="preserve">- Better reasoning and writing quality </w:t>
+      </w:r>
+      <w:r>
+        <w:rPr>
+          <w:sz w:val="24"/>
+          <w:szCs w:val="24"/>
+        </w:rPr>
+        <w:t xml:space="preserve">- Good for production work </w:t>
+      </w:r>
+    </w:p>
+    <w:p>
+      <w:pPr>
+        <w:spacing w:after="200"/>
+      </w:pPr>
+      <w:r>
+        <w:rPr>
+          <w:b/>
+          <w:bCs/>
+          <w:sz w:val="24"/>
+          <w:szCs w:val="24"/>
+        </w:rPr>
+        <w:t xml:space="preserve">Perfect for:</w:t>
+      </w:r>
+    </w:p>
+    <w:p>
+      <w:pPr>
+        <w:spacing w:after="200"/>
+      </w:pPr>
+      <w:r>
+        <w:rPr>
+          <w:sz w:val="24"/>
+          <w:szCs w:val="24"/>
+        </w:rPr>
+        <w:t xml:space="preserve">- Writing and editing </w:t>
+      </w:r>
+      <w:r>
+        <w:rPr>
+          <w:sz w:val="24"/>
+          <w:szCs w:val="24"/>
+        </w:rPr>
+        <w:t xml:space="preserve">- Document generation </w:t>
+      </w:r>
+      <w:r>
+        <w:rPr>
+          <w:sz w:val="24"/>
+          <w:szCs w:val="24"/>
+        </w:rPr>
+        <w:t xml:space="preserve">- Analysis tasks </w:t>
+      </w:r>
+      <w:r>
+        <w:rPr>
+          <w:sz w:val="24"/>
+          <w:szCs w:val="24"/>
+        </w:rPr>
+        <w:t xml:space="preserve">- Code generation </w:t>
+      </w:r>
+      <w:r>
+        <w:rPr>
+          <w:sz w:val="24"/>
+          <w:szCs w:val="24"/>
+        </w:rPr>
+        <w:t xml:space="preserve">- Reasoning problems </w:t>
+      </w:r>
+    </w:p>
+    <w:p>
+      <w:pPr>
+        <w:spacing w:after="200"/>
+      </w:pPr>
+      <w:r>
+        <w:rPr>
+          <w:b/>
+          <w:bCs/>
+          <w:sz w:val="24"/>
+          <w:szCs w:val="24"/>
+        </w:rPr>
+        <w:t xml:space="preserve">Models you can use:</w:t>
+      </w:r>
+    </w:p>
+    <w:p>
+      <w:pPr>
+        <w:spacing w:after="200"/>
+      </w:pPr>
+      <w:r>
+        <w:rPr>
+          <w:sz w:val="24"/>
+          <w:szCs w:val="24"/>
+        </w:rPr>
+        <w:t xml:space="preserve">- `qwen2.5:7b` — Excellent balance of speed and quality </w:t>
+      </w:r>
+      <w:r>
+        <w:rPr>
+          <w:sz w:val="24"/>
+          <w:szCs w:val="24"/>
+        </w:rPr>
+        <w:t xml:space="preserve">- `qwen2.5:14b` — Higher quality for demanding tasks </w:t>
+      </w:r>
+      <w:r>
+        <w:rPr>
+          <w:sz w:val="24"/>
+          <w:szCs w:val="24"/>
+        </w:rPr>
+        <w:t xml:space="preserve">- `llama3.1:8b` — Meta's capable model </w:t>
+      </w:r>
+      <w:r>
+        <w:rPr>
+          <w:sz w:val="24"/>
+          <w:szCs w:val="24"/>
+        </w:rPr>
+        <w:t xml:space="preserve">- `gemma2:9b` — Google's strong performer </w:t>
+      </w:r>
+    </w:p>
+    <w:p>
+      <w:pPr>
+        <w:pStyle w:val="Heading3"/>
+        <w:spacing w:after="200" w:before="400"/>
+      </w:pPr>
+      <w:r>
+        <w:t xml:space="preserve">Tier 3: Cloud Thinking (27B-70B+ Parameters)</w:t>
+      </w:r>
+    </w:p>
+    <w:p>
+      <w:pPr>
+        <w:spacing w:after="200"/>
+      </w:pPr>
+      <w:r>
+        <w:rPr>
+          <w:b/>
+          <w:bCs/>
+          <w:sz w:val="24"/>
+          <w:szCs w:val="24"/>
+        </w:rPr>
+        <w:t xml:space="preserve">Think of this as your expert consultant (on speed dial).</w:t>
+      </w:r>
+    </w:p>
+    <w:p>
+      <w:pPr>
+        <w:spacing w:after="200"/>
+      </w:pPr>
+      <w:r>
+        <w:rPr>
+          <w:b/>
+          <w:bCs/>
+          <w:sz w:val="24"/>
+          <w:szCs w:val="24"/>
+        </w:rPr>
+        <w:t xml:space="preserve">What it is:</w:t>
+      </w:r>
+    </w:p>
+    <w:p>
+      <w:pPr>
+        <w:spacing w:after="200"/>
+      </w:pPr>
+      <w:r>
+        <w:rPr>
+          <w:sz w:val="24"/>
+          <w:szCs w:val="24"/>
+        </w:rPr>
+        <w:t xml:space="preserve">- Large models via API or Ollama Cloud </w:t>
+      </w:r>
+      <w:r>
+        <w:rPr>
+          <w:sz w:val="24"/>
+          <w:szCs w:val="24"/>
+        </w:rPr>
+        <w:t xml:space="preserve">- Best quality available </w:t>
+      </w:r>
+      <w:r>
+        <w:rPr>
+          <w:sz w:val="24"/>
+          <w:szCs w:val="24"/>
+        </w:rPr>
+        <w:t xml:space="preserve">- Costs money per use (or use free tokens) </w:t>
+      </w:r>
+      <w:r>
+        <w:rPr>
+          <w:sz w:val="24"/>
+          <w:szCs w:val="24"/>
+        </w:rPr>
+        <w:t xml:space="preserve">- Reserved for complex tasks </w:t>
+      </w:r>
+    </w:p>
+    <w:p>
+      <w:pPr>
+        <w:spacing w:after="200"/>
+      </w:pPr>
+      <w:r>
+        <w:rPr>
+          <w:b/>
+          <w:bCs/>
+          <w:sz w:val="24"/>
+          <w:szCs w:val="24"/>
+        </w:rPr>
+        <w:t xml:space="preserve">Perfect for:</w:t>
+      </w:r>
+    </w:p>
+    <w:p>
+      <w:pPr>
+        <w:spacing w:after="200"/>
+      </w:pPr>
+      <w:r>
+        <w:rPr>
+          <w:sz w:val="24"/>
+          <w:szCs w:val="24"/>
+        </w:rPr>
+        <w:t xml:space="preserve">- Complex reasoning </w:t>
+      </w:r>
+      <w:r>
+        <w:rPr>
+          <w:sz w:val="24"/>
+          <w:szCs w:val="24"/>
+        </w:rPr>
+        <w:t xml:space="preserve">- Creative writing </w:t>
+      </w:r>
+      <w:r>
+        <w:rPr>
+          <w:sz w:val="24"/>
+          <w:szCs w:val="24"/>
+        </w:rPr>
+        <w:t xml:space="preserve">- Difficult problems </w:t>
+      </w:r>
+      <w:r>
+        <w:rPr>
+          <w:sz w:val="24"/>
+          <w:szCs w:val="24"/>
+        </w:rPr>
+        <w:t xml:space="preserve">- Tasks where accuracy is critical </w:t>
+      </w:r>
+    </w:p>
+    <w:p>
+      <w:pPr>
+        <w:spacing w:after="200"/>
+      </w:pPr>
+      <w:r>
+        <w:rPr>
+          <w:b/>
+          <w:bCs/>
+          <w:sz w:val="24"/>
+          <w:szCs w:val="24"/>
+        </w:rPr>
+        <w:t xml:space="preserve">Models you can use:</w:t>
+      </w:r>
+    </w:p>
+    <w:p>
+      <w:pPr>
+        <w:spacing w:after="200"/>
+      </w:pPr>
+      <w:r>
+        <w:rPr>
+          <w:sz w:val="24"/>
+          <w:szCs w:val="24"/>
+        </w:rPr>
+        <w:t xml:space="preserve">- `qwen3.5:32b` — Very capable, reasonable cost </w:t>
+      </w:r>
+      <w:r>
+        <w:rPr>
+          <w:sz w:val="24"/>
+          <w:szCs w:val="24"/>
+        </w:rPr>
+        <w:t xml:space="preserve">- `qwen3.5:27b` — High quality via Ollama Cloud </w:t>
+      </w:r>
+      <w:r>
+        <w:rPr>
+          <w:sz w:val="24"/>
+          <w:szCs w:val="24"/>
+        </w:rPr>
+        <w:t xml:space="preserve">- `llama4:scout` — 108B parameters (requires GPU or patience!) </w:t>
+      </w:r>
+      <w:r>
+        <w:rPr>
+          <w:sz w:val="24"/>
+          <w:szCs w:val="24"/>
+        </w:rPr>
+        <w:t xml:space="preserve">- `glm-4.7-flash` — 29B parameters, excellent multilingual </w:t>
+      </w:r>
+      <w:r>
+        <w:rPr>
+          <w:sz w:val="24"/>
+          <w:szCs w:val="24"/>
+        </w:rPr>
+        <w:t xml:space="preserve">- Cloud APIs: GPT-4, Claude, etc. </w:t>
+      </w:r>
+    </w:p>
+    <w:p>
+      <w:pPr>
+        <w:pStyle w:val="Heading2"/>
+        <w:spacing w:after="200" w:before="400"/>
+      </w:pPr>
+      <w:r>
+        <w:t xml:space="preserve">Your Options: From Minimal to Maximum</w:t>
+      </w:r>
+    </w:p>
+    <w:p>
+      <w:pPr>
+        <w:pStyle w:val="Heading3"/>
+        <w:spacing w:after="200" w:before="400"/>
+      </w:pPr>
+      <w:r>
+        <w:t xml:space="preserve">Option A: Minimal Setup (Recommended for Beginners)</w:t>
+      </w:r>
+    </w:p>
+    <w:p>
+      <w:pPr>
+        <w:spacing w:after="200"/>
+      </w:pPr>
+      <w:r>
+        <w:rPr>
+          <w:b/>
+          <w:bCs/>
+          <w:sz w:val="24"/>
+          <w:szCs w:val="24"/>
+        </w:rPr>
+        <w:t xml:space="preserve">Hardware:</w:t>
+      </w:r>
+      <w:r>
+        <w:rPr>
+          <w:sz w:val="24"/>
+          <w:szCs w:val="24"/>
+        </w:rPr>
+        <w:t xml:space="preserve"> Any modern laptop (4GB+ RAM)</w:t>
+      </w:r>
+    </w:p>
+    <w:p>
+      <w:pPr>
+        <w:spacing w:after="200"/>
+      </w:pPr>
+      <w:r>
+        <w:rPr>
+          <w:b/>
+          <w:bCs/>
+          <w:sz w:val="24"/>
+          <w:szCs w:val="24"/>
+        </w:rPr>
+        <w:t xml:space="preserve">Models:</w:t>
+      </w:r>
+      <w:r>
+        <w:rPr>
+          <w:sz w:val="24"/>
+          <w:szCs w:val="24"/>
+        </w:rPr>
+        <w:t xml:space="preserve"> 2B-7B parameters only</w:t>
+      </w:r>
+    </w:p>
+    <w:p>
+      <w:pPr>
+        <w:spacing w:after="200"/>
+      </w:pPr>
+      <w:r>
+        <w:rPr>
+          <w:b/>
+          <w:bCs/>
+          <w:sz w:val="24"/>
+          <w:szCs w:val="24"/>
+        </w:rPr>
+        <w:t xml:space="preserve">Cost:</w:t>
+      </w:r>
+      <w:r>
+        <w:rPr>
+          <w:sz w:val="24"/>
+          <w:szCs w:val="24"/>
+        </w:rPr>
+        <w:t xml:space="preserve"> $0/month</w:t>
+      </w:r>
+    </w:p>
+    <w:p>
+      <w:pPr>
+        <w:spacing w:after="200"/>
+      </w:pPr>
+      <w:r>
+        <w:rPr>
+          <w:b/>
+          <w:bCs/>
+          <w:sz w:val="24"/>
+          <w:szCs w:val="24"/>
+        </w:rPr>
+        <w:t xml:space="preserve">Speed:</w:t>
+      </w:r>
+      <w:r>
+        <w:rPr>
+          <w:sz w:val="24"/>
+          <w:szCs w:val="24"/>
+        </w:rPr>
+        <w:t xml:space="preserve"> Fast (5-30 second responses)</w:t>
+      </w:r>
+    </w:p>
+    <w:p>
+      <w:pPr>
+        <w:spacing w:after="200"/>
+      </w:pPr>
+      <w:r>
+        <w:rPr>
+          <w:b/>
+          <w:bCs/>
+          <w:sz w:val="24"/>
+          <w:szCs w:val="24"/>
+        </w:rPr>
+        <w:t xml:space="preserve">Works great for:</w:t>
+      </w:r>
+    </w:p>
+    <w:p>
+      <w:pPr>
+        <w:spacing w:after="200"/>
+      </w:pPr>
+      <w:r>
+        <w:rPr>
+          <w:sz w:val="24"/>
+          <w:szCs w:val="24"/>
+        </w:rPr>
+        <w:t xml:space="preserve">- Personal assistant </w:t>
+      </w:r>
+      <w:r>
+        <w:rPr>
+          <w:sz w:val="24"/>
+          <w:szCs w:val="24"/>
+        </w:rPr>
+        <w:t xml:space="preserve">- Document chat </w:t>
+      </w:r>
+      <w:r>
+        <w:rPr>
+          <w:sz w:val="24"/>
+          <w:szCs w:val="24"/>
+        </w:rPr>
+        <w:t xml:space="preserve">- Writing help </w:t>
+      </w:r>
+      <w:r>
+        <w:rPr>
+          <w:sz w:val="24"/>
+          <w:szCs w:val="24"/>
+        </w:rPr>
+        <w:t xml:space="preserve">- Learning and experimentation </w:t>
+      </w:r>
+    </w:p>
+    <w:p>
+      <w:pPr>
+        <w:spacing w:after="200"/>
+      </w:pPr>
+      <w:r>
+        <w:rPr>
+          <w:b/>
+          <w:bCs/>
+          <w:sz w:val="24"/>
+          <w:szCs w:val="24"/>
+        </w:rPr>
+        <w:t xml:space="preserve">Models:</w:t>
+      </w:r>
+    </w:p>
+    <w:p>
+      <w:pPr>
+        <w:shd w:fill="F5F5F5"/>
+        <w:spacing w:after="100" w:before="100"/>
+      </w:pPr>
+      <w:r>
+        <w:rPr>
+          <w:rFonts w:ascii="Courier New" w:cs="Courier New" w:eastAsia="Courier New" w:hAnsi="Courier New"/>
+          <w:sz w:val="20"/>
+          <w:szCs w:val="20"/>
+        </w:rPr>
+        <w:t xml:space="preserve">
+</w:t>
+      </w:r>
+    </w:p>
+    <w:p>
+      <w:pPr>
+        <w:pStyle w:val="Heading3"/>
+        <w:spacing w:after="200" w:before="400"/>
+      </w:pPr>
+      <w:r>
+        <w:t xml:space="preserve">Option B: Balanced Setup (What This Book Demonstrates)</w:t>
+      </w:r>
+    </w:p>
+    <w:p>
+      <w:pPr>
+        <w:spacing w:after="200"/>
+      </w:pPr>
+      <w:r>
+        <w:rPr>
+          <w:b/>
+          <w:bCs/>
+          <w:sz w:val="24"/>
+          <w:szCs w:val="24"/>
+        </w:rPr>
+        <w:t xml:space="preserve">Hardware:</w:t>
+      </w:r>
+      <w:r>
+        <w:rPr>
+          <w:sz w:val="24"/>
+          <w:szCs w:val="24"/>
+        </w:rPr>
+        <w:t xml:space="preserve"> Laptop with 8GB+ RAM</w:t>
+      </w:r>
+    </w:p>
+    <w:p>
+      <w:pPr>
+        <w:spacing w:after="200"/>
+      </w:pPr>
+      <w:r>
+        <w:rPr>
+          <w:b/>
+          <w:bCs/>
+          <w:sz w:val="24"/>
+          <w:szCs w:val="24"/>
+        </w:rPr>
+        <w:t xml:space="preserve">Models:</w:t>
+      </w:r>
+      <w:r>
+        <w:rPr>
+          <w:sz w:val="24"/>
+          <w:szCs w:val="24"/>
+        </w:rPr>
+        <w:t xml:space="preserve"> 2B-14B local + occasional cloud</w:t>
+      </w:r>
+    </w:p>
+    <w:p>
+      <w:pPr>
+        <w:spacing w:after="200"/>
+      </w:pPr>
+      <w:r>
+        <w:rPr>
+          <w:b/>
+          <w:bCs/>
+          <w:sz w:val="24"/>
+          <w:szCs w:val="24"/>
+        </w:rPr>
+        <w:t xml:space="preserve">Cost:</w:t>
+      </w:r>
+      <w:r>
+        <w:rPr>
+          <w:sz w:val="24"/>
+          <w:szCs w:val="24"/>
+        </w:rPr>
+        <w:t xml:space="preserve"> $0-20/month (cloud for heavy tasks)</w:t>
+      </w:r>
+    </w:p>
+    <w:p>
+      <w:pPr>
+        <w:spacing w:after="200"/>
+      </w:pPr>
+      <w:r>
+        <w:rPr>
+          <w:b/>
+          <w:bCs/>
+          <w:sz w:val="24"/>
+          <w:szCs w:val="24"/>
+        </w:rPr>
+        <w:t xml:space="preserve">Speed:</w:t>
+      </w:r>
+      <w:r>
+        <w:rPr>
+          <w:sz w:val="24"/>
+          <w:szCs w:val="24"/>
+        </w:rPr>
+        <w:t xml:space="preserve"> Fast local, slower cloud</w:t>
+      </w:r>
+    </w:p>
+    <w:p>
+      <w:pPr>
+        <w:spacing w:after="200"/>
+      </w:pPr>
+      <w:r>
+        <w:rPr>
+          <w:b/>
+          <w:bCs/>
+          <w:sz w:val="24"/>
+          <w:szCs w:val="24"/>
+        </w:rPr>
+        <w:t xml:space="preserve">Works great for:</w:t>
+      </w:r>
+    </w:p>
+    <w:p>
+      <w:pPr>
+        <w:spacing w:after="200"/>
+      </w:pPr>
+      <w:r>
+        <w:rPr>
+          <w:sz w:val="24"/>
+          <w:szCs w:val="24"/>
+        </w:rPr>
+        <w:t xml:space="preserve">- Professional use </w:t>
+      </w:r>
+      <w:r>
+        <w:rPr>
+          <w:sz w:val="24"/>
+          <w:szCs w:val="24"/>
+        </w:rPr>
+        <w:t xml:space="preserve">- Document processing </w:t>
+      </w:r>
+      <w:r>
+        <w:rPr>
+          <w:sz w:val="24"/>
+          <w:szCs w:val="24"/>
+        </w:rPr>
+        <w:t xml:space="preserve">- Research assistance </w:t>
+      </w:r>
+      <w:r>
+        <w:rPr>
+          <w:sz w:val="24"/>
+          <w:szCs w:val="24"/>
+        </w:rPr>
+        <w:t xml:space="preserve">- Content creation </w:t>
+      </w:r>
+    </w:p>
+    <w:p>
+      <w:pPr>
+        <w:spacing w:after="200"/>
+      </w:pPr>
+      <w:r>
+        <w:rPr>
+          <w:b/>
+          <w:bCs/>
+          <w:sz w:val="24"/>
+          <w:szCs w:val="24"/>
+        </w:rPr>
+        <w:t xml:space="preserve">Models:</w:t>
+      </w:r>
+    </w:p>
+    <w:p>
+      <w:pPr>
+        <w:shd w:fill="F5F5F5"/>
+        <w:spacing w:after="100" w:before="100"/>
+      </w:pPr>
+      <w:r>
+        <w:rPr>
+          <w:rFonts w:ascii="Courier New" w:cs="Courier New" w:eastAsia="Courier New" w:hAnsi="Courier New"/>
+          <w:sz w:val="20"/>
+          <w:szCs w:val="20"/>
+        </w:rPr>
+        <w:t xml:space="preserve">
+</w:t>
+      </w:r>
+    </w:p>
+    <w:p>
+      <w:pPr>
+        <w:pStyle w:val="Heading3"/>
+        <w:spacing w:after="200" w:before="400"/>
+      </w:pPr>
+      <w:r>
+        <w:t xml:space="preserve">Option C: Maximum Capability (Power User)</w:t>
+      </w:r>
+    </w:p>
+    <w:p>
+      <w:pPr>
+        <w:spacing w:after="200"/>
+      </w:pPr>
+      <w:r>
+        <w:rPr>
+          <w:b/>
+          <w:bCs/>
+          <w:sz w:val="24"/>
+          <w:szCs w:val="24"/>
+        </w:rPr>
+        <w:t xml:space="preserve">Hardware:</w:t>
+      </w:r>
+      <w:r>
+        <w:rPr>
+          <w:sz w:val="24"/>
+          <w:szCs w:val="24"/>
+        </w:rPr>
+        <w:t xml:space="preserve"> Desktop with 16GB+ RAM or GPU</w:t>
+      </w:r>
+    </w:p>
+    <w:p>
+      <w:pPr>
+        <w:spacing w:after="200"/>
+      </w:pPr>
+      <w:r>
+        <w:rPr>
+          <w:b/>
+          <w:bCs/>
+          <w:sz w:val="24"/>
+          <w:szCs w:val="24"/>
+        </w:rPr>
+        <w:t xml:space="preserve">Models:</w:t>
+      </w:r>
+      <w:r>
+        <w:rPr>
+          <w:sz w:val="24"/>
+          <w:szCs w:val="24"/>
+        </w:rPr>
+        <w:t xml:space="preserve"> Everything up to 108B parameters</w:t>
+      </w:r>
+    </w:p>
+    <w:p>
+      <w:pPr>
+        <w:spacing w:after="200"/>
+      </w:pPr>
+      <w:r>
+        <w:rPr>
+          <w:b/>
+          <w:bCs/>
+          <w:sz w:val="24"/>
+          <w:szCs w:val="24"/>
+        </w:rPr>
+        <w:t xml:space="preserve">Cost:</w:t>
+      </w:r>
+      <w:r>
+        <w:rPr>
+          <w:sz w:val="24"/>
+          <w:szCs w:val="24"/>
+        </w:rPr>
+        <w:t xml:space="preserve"> $0 (if patient) or $20-100/month</w:t>
+      </w:r>
+    </w:p>
+    <w:p>
+      <w:pPr>
+        <w:spacing w:after="200"/>
+      </w:pPr>
+      <w:r>
+        <w:rPr>
+          <w:b/>
+          <w:bCs/>
+          <w:sz w:val="24"/>
+          <w:szCs w:val="24"/>
+        </w:rPr>
+        <w:t xml:space="preserve">Speed:</w:t>
+      </w:r>
+      <w:r>
+        <w:rPr>
+          <w:sz w:val="24"/>
+          <w:szCs w:val="24"/>
+        </w:rPr>
+        <w:t xml:space="preserve"> Varies (2B = fast, 108B = very slow on CPU)</w:t>
+      </w:r>
+    </w:p>
+    <w:p>
+      <w:pPr>
+        <w:spacing w:after="200"/>
+      </w:pPr>
+      <w:r>
+        <w:rPr>
+          <w:b/>
+          <w:bCs/>
+          <w:sz w:val="24"/>
+          <w:szCs w:val="24"/>
+        </w:rPr>
+        <w:t xml:space="preserve">Works great for:</w:t>
+      </w:r>
+    </w:p>
+    <w:p>
+      <w:pPr>
+        <w:spacing w:after="200"/>
+      </w:pPr>
+      <w:r>
+        <w:rPr>
+          <w:sz w:val="24"/>
+          <w:szCs w:val="24"/>
+        </w:rPr>
+        <w:t xml:space="preserve">- Complex analysis </w:t>
+      </w:r>
+      <w:r>
+        <w:rPr>
+          <w:sz w:val="24"/>
+          <w:szCs w:val="24"/>
+        </w:rPr>
+        <w:t xml:space="preserve">- Professional writing </w:t>
+      </w:r>
+      <w:r>
+        <w:rPr>
+          <w:sz w:val="24"/>
+          <w:szCs w:val="24"/>
+        </w:rPr>
+        <w:t xml:space="preserve">- Code generation </w:t>
+      </w:r>
+      <w:r>
+        <w:rPr>
+          <w:sz w:val="24"/>
+          <w:szCs w:val="24"/>
+        </w:rPr>
+        <w:t xml:space="preserve">- Research </w:t>
+      </w:r>
+    </w:p>
+    <w:p>
+      <w:pPr>
+        <w:spacing w:after="200"/>
+      </w:pPr>
+      <w:r>
+        <w:rPr>
+          <w:b/>
+          <w:bCs/>
+          <w:sz w:val="24"/>
+          <w:szCs w:val="24"/>
+        </w:rPr>
+        <w:t xml:space="preserve">Models:</w:t>
+      </w:r>
+    </w:p>
+    <w:p>
+      <w:pPr>
+        <w:shd w:fill="F5F5F5"/>
+        <w:spacing w:after="100" w:before="100"/>
+      </w:pPr>
+      <w:r>
+        <w:rPr>
+          <w:rFonts w:ascii="Courier New" w:cs="Courier New" w:eastAsia="Courier New" w:hAnsi="Courier New"/>
+          <w:sz w:val="20"/>
+          <w:szCs w:val="20"/>
+        </w:rPr>
+        <w:t xml:space="preserve">
+</w:t>
+      </w:r>
+    </w:p>
+    <w:p>
+      <w:pPr>
+        <w:pStyle w:val="Heading3"/>
+        <w:spacing w:after="200" w:before="400"/>
+      </w:pPr>
+      <w:r>
+        <w:t xml:space="preserve">Option D: Enterprise Setup (Future Chapter)</w:t>
+      </w:r>
+    </w:p>
+    <w:p>
+      <w:pPr>
+        <w:spacing w:after="200"/>
+      </w:pPr>
+      <w:r>
+        <w:rPr>
+          <w:b/>
+          <w:bCs/>
+          <w:sz w:val="24"/>
+          <w:szCs w:val="24"/>
+        </w:rPr>
+        <w:t xml:space="preserve">Hardware:</w:t>
+      </w:r>
+      <w:r>
+        <w:rPr>
+          <w:sz w:val="24"/>
+          <w:szCs w:val="24"/>
+        </w:rPr>
+        <w:t xml:space="preserve"> Server with GPU(s)</w:t>
+      </w:r>
+    </w:p>
+    <w:p>
+      <w:pPr>
+        <w:spacing w:after="200"/>
+      </w:pPr>
+      <w:r>
+        <w:rPr>
+          <w:b/>
+          <w:bCs/>
+          <w:sz w:val="24"/>
+          <w:szCs w:val="24"/>
+        </w:rPr>
+        <w:t xml:space="preserve">Backend:</w:t>
+      </w:r>
+      <w:r>
+        <w:rPr>
+          <w:sz w:val="24"/>
+          <w:szCs w:val="24"/>
+        </w:rPr>
+        <w:t xml:space="preserve"> vLLM for serving</w:t>
+      </w:r>
+    </w:p>
+    <w:p>
+      <w:pPr>
+        <w:spacing w:after="200"/>
+      </w:pPr>
+      <w:r>
+        <w:rPr>
+          <w:b/>
+          <w:bCs/>
+          <w:sz w:val="24"/>
+          <w:szCs w:val="24"/>
+        </w:rPr>
+        <w:t xml:space="preserve">Cost:</w:t>
+      </w:r>
+      <w:r>
+        <w:rPr>
+          <w:sz w:val="24"/>
+          <w:szCs w:val="24"/>
+        </w:rPr>
+        <w:t xml:space="preserve"> Depends on usage</w:t>
+      </w:r>
+    </w:p>
+    <w:p>
+      <w:pPr>
+        <w:spacing w:after="200"/>
+      </w:pPr>
+      <w:r>
+        <w:rPr>
+          <w:b/>
+          <w:bCs/>
+          <w:sz w:val="24"/>
+          <w:szCs w:val="24"/>
+        </w:rPr>
+        <w:t xml:space="preserve">Speed:</w:t>
+      </w:r>
+      <w:r>
+        <w:rPr>
+          <w:sz w:val="24"/>
+          <w:szCs w:val="24"/>
+        </w:rPr>
+        <w:t xml:space="preserve"> Fast for many users</w:t>
+      </w:r>
+    </w:p>
+    <w:p>
+      <w:pPr>
+        <w:spacing w:after="200"/>
+      </w:pPr>
+      <w:r>
+        <w:rPr>
+          <w:b/>
+          <w:bCs/>
+          <w:sz w:val="24"/>
+          <w:szCs w:val="24"/>
+        </w:rPr>
+        <w:t xml:space="preserve">Works great for:</w:t>
+      </w:r>
+    </w:p>
+    <w:p>
+      <w:pPr>
+        <w:spacing w:after="200"/>
+      </w:pPr>
+      <w:r>
+        <w:rPr>
+          <w:sz w:val="24"/>
+          <w:szCs w:val="24"/>
+        </w:rPr>
+        <w:t xml:space="preserve">- Teams </w:t>
+      </w:r>
+      <w:r>
+        <w:rPr>
+          <w:sz w:val="24"/>
+          <w:szCs w:val="24"/>
+        </w:rPr>
+        <w:t xml:space="preserve">- High-throughput APIs </w:t>
+      </w:r>
+      <w:r>
+        <w:rPr>
+          <w:sz w:val="24"/>
+          <w:szCs w:val="24"/>
+        </w:rPr>
+        <w:t xml:space="preserve">- Production services </w:t>
+      </w:r>
+      <w:r>
+        <w:rPr>
+          <w:sz w:val="24"/>
+          <w:szCs w:val="24"/>
+        </w:rPr>
+        <w:t xml:space="preserve">- Many concurrent users </w:t>
+      </w:r>
+    </w:p>
+    <w:p>
+      <w:pPr>
+        <w:spacing w:after="200"/>
+      </w:pPr>
+      <w:r>
+        <w:rPr>
+          <w:b/>
+          <w:bCs/>
+          <w:sz w:val="24"/>
+          <w:szCs w:val="24"/>
+        </w:rPr>
+        <w:t xml:space="preserve">We'll cover this in Chapter 21: Scaling to Enterprise</w:t>
+      </w:r>
+    </w:p>
+    <w:p>
+      <w:pPr>
+        <w:pStyle w:val="Heading2"/>
+        <w:spacing w:after="200" w:before="400"/>
+      </w:pPr>
+      <w:r>
+        <w:t xml:space="preserve">Why Not Just Use the Biggest Model?</w:t>
+      </w:r>
+    </w:p>
+    <w:p>
+      <w:pPr>
+        <w:spacing w:after="200"/>
+      </w:pPr>
+      <w:r>
+        <w:rPr>
+          <w:b/>
+          <w:bCs/>
+          <w:sz w:val="24"/>
+          <w:szCs w:val="24"/>
+        </w:rPr>
+        <w:t xml:space="preserve">The short answer:</w:t>
+      </w:r>
+      <w:r>
+        <w:rPr>
+          <w:sz w:val="24"/>
+          <w:szCs w:val="24"/>
+        </w:rPr>
+        <w:t xml:space="preserve"> You could, but you'd be wasting resources.</w:t>
+      </w:r>
+    </w:p>
+    <w:p>
+      <w:pPr>
+        <w:spacing w:after="200"/>
+      </w:pPr>
+      <w:r>
+        <w:rPr>
+          <w:b/>
+          <w:bCs/>
+          <w:sz w:val="24"/>
+          <w:szCs w:val="24"/>
+        </w:rPr>
+        <w:t xml:space="preserve">Analogy:</w:t>
+      </w:r>
+    </w:p>
+    <w:p>
+      <w:pPr>
+        <w:spacing w:after="200"/>
+      </w:pPr>
+      <w:r>
+        <w:rPr>
+          <w:sz w:val="24"/>
+          <w:szCs w:val="24"/>
+        </w:rPr>
+        <w:t xml:space="preserve">- Sending a text message? Use your phone (lightweight model) </w:t>
+      </w:r>
+      <w:r>
+        <w:rPr>
+          <w:sz w:val="24"/>
+          <w:szCs w:val="24"/>
+        </w:rPr>
+        <w:t xml:space="preserve">- Writing a novel? Use your laptop (capable model) </w:t>
+      </w:r>
+      <w:r>
+        <w:rPr>
+          <w:sz w:val="24"/>
+          <w:szCs w:val="24"/>
+        </w:rPr>
+        <w:t xml:space="preserve">- Calculating rocket trajectories? Use a supercomputer (large model) </w:t>
+      </w:r>
+    </w:p>
+    <w:p>
+      <w:pPr>
+        <w:spacing w:after="200"/>
+      </w:pPr>
+      <w:r>
+        <w:rPr>
+          <w:b/>
+          <w:bCs/>
+          <w:sz w:val="24"/>
+          <w:szCs w:val="24"/>
+        </w:rPr>
+        <w:t xml:space="preserve">Different tasks need different tools.</w:t>
+      </w:r>
+      <w:r>
+        <w:rPr>
+          <w:sz w:val="24"/>
+          <w:szCs w:val="24"/>
+        </w:rPr>
+        <w:t xml:space="preserve"> Using a 108B parameter model to answer "What time is it?" is like using a nuclear reactor to toast bread.</w:t>
+      </w:r>
+    </w:p>
+    <w:p>
+      <w:pPr>
+        <w:spacing w:after="200"/>
+      </w:pPr>
+      <w:r>
+        <w:rPr>
+          <w:b/>
+          <w:bCs/>
+          <w:sz w:val="24"/>
+          <w:szCs w:val="24"/>
+        </w:rPr>
+        <w:t xml:space="preserve">The Smart Approach:</w:t>
+      </w:r>
+    </w:p>
+    <w:p>
+      <w:pPr>
+        <w:spacing w:after="200"/>
+      </w:pPr>
+      <w:r>
+        <w:rPr>
+          <w:sz w:val="24"/>
+          <w:szCs w:val="24"/>
+        </w:rPr>
+        <w:t xml:space="preserve">1. Use 2B-7B models for 80% of tasks (fast, free) </w:t>
+      </w:r>
+      <w:r>
+        <w:rPr>
+          <w:sz w:val="24"/>
+          <w:szCs w:val="24"/>
+        </w:rPr>
+        <w:t xml:space="preserve">2. Use 14B models for 15% of tasks (quality, still free) </w:t>
+      </w:r>
+      <w:r>
+        <w:rPr>
+          <w:sz w:val="24"/>
+          <w:szCs w:val="24"/>
+        </w:rPr>
+        <w:t xml:space="preserve">3. Use 27B+ models for 5% of tasks (when accuracy matters most) </w:t>
+      </w:r>
+    </w:p>
+    <w:p>
+      <w:pPr>
+        <w:spacing w:after="200"/>
+      </w:pPr>
+      <w:r>
+        <w:rPr>
+          <w:b/>
+          <w:bCs/>
+          <w:sz w:val="24"/>
+          <w:szCs w:val="24"/>
+        </w:rPr>
+        <w:t xml:space="preserve">Result:</w:t>
+      </w:r>
+      <w:r>
+        <w:rPr>
+          <w:sz w:val="24"/>
+          <w:szCs w:val="24"/>
+        </w:rPr>
+        <w:t xml:space="preserve"> Better performance, lower cost, faster responses.</w:t>
+      </w:r>
+    </w:p>
+    <w:p>
+      <w:pPr>
+        <w:pStyle w:val="Heading2"/>
+        <w:spacing w:after="200" w:before="400"/>
+      </w:pPr>
+      <w:r>
+        <w:t xml:space="preserve">How the Model Router Works</w:t>
+      </w:r>
+    </w:p>
+    <w:p>
+      <w:pPr>
+        <w:spacing w:after="200"/>
+      </w:pPr>
+      <w:r>
+        <w:rPr>
+          <w:sz w:val="24"/>
+          <w:szCs w:val="24"/>
+        </w:rPr>
+        <w:t xml:space="preserve">[Rest of chapter continues with existing content about the implementation...] </w:t>
       </w:r>
     </w:p>
     <w:p>

</xml_diff>